<commit_message>
2627K1T5.16.358.Hoàng Kha - giới thiệu bản thân
</commit_message>
<xml_diff>
--- a/2627K1T5.16.358.Hoàng Kha - giới thiệu bản thân.docx
+++ b/2627K1T5.16.358.Hoàng Kha - giới thiệu bản thân.docx
@@ -6,9 +6,6 @@
       <w:pPr>
         <w:spacing w:after="40"/>
         <w:jc w:val="center"/>
-        <w:rPr>
-          <w:rFonts w:hint="eastAsia"/>
-        </w:rPr>
       </w:pPr>
       <w:r>
         <w:rPr>
@@ -16,80 +13,13 @@
           <w:color w:val="1A365D"/>
           <w:sz w:val="36"/>
         </w:rPr>
-        <w:t>BÁO CÁO GI</w:t>
-      </w:r>
-      <w:r>
-        <w:rPr>
-          <w:b/>
-          <w:color w:val="1A365D"/>
-          <w:sz w:val="36"/>
-        </w:rPr>
-        <w:t>Ớ</w:t>
-      </w:r>
-      <w:r>
-        <w:rPr>
-          <w:b/>
-          <w:color w:val="1A365D"/>
-          <w:sz w:val="36"/>
-        </w:rPr>
-        <w:t>I THI</w:t>
-      </w:r>
-      <w:r>
-        <w:rPr>
-          <w:b/>
-          <w:color w:val="1A365D"/>
-          <w:sz w:val="36"/>
-        </w:rPr>
-        <w:t>Ệ</w:t>
-      </w:r>
-      <w:r>
-        <w:rPr>
-          <w:b/>
-          <w:color w:val="1A365D"/>
-          <w:sz w:val="36"/>
-        </w:rPr>
-        <w:t>U B</w:t>
-      </w:r>
-      <w:r>
-        <w:rPr>
-          <w:b/>
-          <w:color w:val="1A365D"/>
-          <w:sz w:val="36"/>
-        </w:rPr>
-        <w:t>Ả</w:t>
-      </w:r>
-      <w:r>
-        <w:rPr>
-          <w:b/>
-          <w:color w:val="1A365D"/>
-          <w:sz w:val="36"/>
-        </w:rPr>
-        <w:t>N THÂN &amp; H</w:t>
-      </w:r>
-      <w:r>
-        <w:rPr>
-          <w:b/>
-          <w:color w:val="1A365D"/>
-          <w:sz w:val="36"/>
-        </w:rPr>
-        <w:t>Ồ</w:t>
-      </w:r>
-      <w:r>
-        <w:rPr>
-          <w:b/>
-          <w:color w:val="1A365D"/>
-          <w:sz w:val="36"/>
-        </w:rPr>
-        <w:t xml:space="preserve"> SƠ CÁ NHÂN</w:t>
+        <w:t>BÁO CÁO GIỚI THIỆU BẢN THÂN &amp; HỒ SƠ CÁ NHÂN</w:t>
       </w:r>
     </w:p>
     <w:p>
       <w:pPr>
         <w:spacing w:after="320"/>
         <w:jc w:val="center"/>
-        <w:rPr>
-          <w:rFonts w:hint="eastAsia"/>
-        </w:rPr>
       </w:pPr>
       <w:r>
         <w:rPr>
@@ -97,55 +27,7 @@
           <w:color w:val="718096"/>
           <w:sz w:val="22"/>
         </w:rPr>
-        <w:t>Bài t</w:t>
-      </w:r>
-      <w:r>
-        <w:rPr>
-          <w:i/>
-          <w:color w:val="718096"/>
-          <w:sz w:val="22"/>
-        </w:rPr>
-        <w:t>ậ</w:t>
-      </w:r>
-      <w:r>
-        <w:rPr>
-          <w:i/>
-          <w:color w:val="718096"/>
-          <w:sz w:val="22"/>
-        </w:rPr>
-        <w:t>p Commit đ</w:t>
-      </w:r>
-      <w:r>
-        <w:rPr>
-          <w:i/>
-          <w:color w:val="718096"/>
-          <w:sz w:val="22"/>
-        </w:rPr>
-        <w:t>ầ</w:t>
-      </w:r>
-      <w:r>
-        <w:rPr>
-          <w:i/>
-          <w:color w:val="718096"/>
-          <w:sz w:val="22"/>
-        </w:rPr>
-        <w:t>u tiên — Môn h</w:t>
-      </w:r>
-      <w:r>
-        <w:rPr>
-          <w:i/>
-          <w:color w:val="718096"/>
-          <w:sz w:val="22"/>
-        </w:rPr>
-        <w:t>ọ</w:t>
-      </w:r>
-      <w:r>
-        <w:rPr>
-          <w:i/>
-          <w:color w:val="718096"/>
-          <w:sz w:val="22"/>
-        </w:rPr>
-        <w:t>c CNTT</w:t>
+        <w:t>Bài tập Commit đầu tiên — Môn học CNTT</w:t>
       </w:r>
     </w:p>
     <w:tbl>
@@ -179,9 +61,6 @@
           <w:p>
             <w:pPr>
               <w:spacing w:after="40"/>
-              <w:rPr>
-                <w:rFonts w:hint="eastAsia"/>
-              </w:rPr>
             </w:pPr>
             <w:r>
               <w:rPr>
@@ -189,44 +68,19 @@
                 <w:color w:val="2B6CB0"/>
                 <w:sz w:val="22"/>
               </w:rPr>
-              <w:t>📌</w:t>
-            </w:r>
-            <w:r>
-              <w:rPr>
-                <w:b/>
-                <w:color w:val="2B6CB0"/>
-                <w:sz w:val="22"/>
-              </w:rPr>
-              <w:t xml:space="preserve"> THÔNG TIN SINH VIÊN</w:t>
+              <w:t>📌 THÔNG TIN SINH VIÊN</w:t>
             </w:r>
           </w:p>
           <w:p>
             <w:pPr>
               <w:spacing w:after="40" w:line="276" w:lineRule="auto"/>
-              <w:rPr>
-                <w:rFonts w:hint="eastAsia"/>
-              </w:rPr>
             </w:pPr>
             <w:r>
               <w:rPr>
                 <w:b/>
                 <w:sz w:val="20"/>
               </w:rPr>
-              <w:t>•  H</w:t>
-            </w:r>
-            <w:r>
-              <w:rPr>
-                <w:b/>
-                <w:sz w:val="20"/>
-              </w:rPr>
-              <w:t>ọ</w:t>
-            </w:r>
-            <w:r>
-              <w:rPr>
-                <w:b/>
-                <w:sz w:val="20"/>
-              </w:rPr>
-              <w:t xml:space="preserve"> và tên: </w:t>
+              <w:t xml:space="preserve">•  Họ và tên: </w:t>
             </w:r>
             <w:r>
               <w:rPr>
@@ -240,7 +94,7 @@
             <w:pPr>
               <w:spacing w:after="40" w:line="276" w:lineRule="auto"/>
               <w:rPr>
-                <w:rFonts w:hint="eastAsia"/>
+                <w:lang w:val="vi-VN"/>
               </w:rPr>
             </w:pPr>
             <w:r>
@@ -248,128 +102,54 @@
                 <w:b/>
                 <w:sz w:val="20"/>
               </w:rPr>
-              <w:t>•  Mã sinh viên / Mã l</w:t>
+              <w:t>•  Mã sinh viê</w:t>
+            </w:r>
+            <w:r>
+              <w:rPr>
+                <w:b/>
+                <w:sz w:val="20"/>
+                <w:lang w:val="vi-VN"/>
+              </w:rPr>
+              <w:t>n</w:t>
             </w:r>
             <w:r>
               <w:rPr>
                 <w:b/>
                 <w:sz w:val="20"/>
               </w:rPr>
-              <w:t>ớ</w:t>
+              <w:t xml:space="preserve">: </w:t>
             </w:r>
+            <w:r>
+              <w:rPr>
+                <w:color w:val="1A202C"/>
+                <w:sz w:val="20"/>
+                <w:lang w:val="vi-VN"/>
+              </w:rPr>
+              <w:t>2001230358</w:t>
+            </w:r>
+          </w:p>
+          <w:p>
+            <w:pPr>
+              <w:spacing w:after="40" w:line="276" w:lineRule="auto"/>
+            </w:pPr>
             <w:r>
               <w:rPr>
                 <w:b/>
                 <w:sz w:val="20"/>
               </w:rPr>
-              <w:t xml:space="preserve">p: </w:t>
+              <w:t xml:space="preserve">•  Trường Đào tạo: </w:t>
             </w:r>
             <w:r>
               <w:rPr>
                 <w:color w:val="1A202C"/>
                 <w:sz w:val="20"/>
               </w:rPr>
-              <w:t>2627K1T5.16.358</w:t>
+              <w:t>Trường Đại học Công Thương TP.HCM (HUIT)</w:t>
             </w:r>
           </w:p>
           <w:p>
             <w:pPr>
               <w:spacing w:after="40" w:line="276" w:lineRule="auto"/>
-              <w:rPr>
-                <w:rFonts w:hint="eastAsia"/>
-              </w:rPr>
-            </w:pPr>
-            <w:r>
-              <w:rPr>
-                <w:b/>
-                <w:sz w:val="20"/>
-              </w:rPr>
-              <w:t>•  Trư</w:t>
-            </w:r>
-            <w:r>
-              <w:rPr>
-                <w:b/>
-                <w:sz w:val="20"/>
-              </w:rPr>
-              <w:t>ờ</w:t>
-            </w:r>
-            <w:r>
-              <w:rPr>
-                <w:b/>
-                <w:sz w:val="20"/>
-              </w:rPr>
-              <w:t>ng Đào t</w:t>
-            </w:r>
-            <w:r>
-              <w:rPr>
-                <w:b/>
-                <w:sz w:val="20"/>
-              </w:rPr>
-              <w:t>ạ</w:t>
-            </w:r>
-            <w:r>
-              <w:rPr>
-                <w:b/>
-                <w:sz w:val="20"/>
-              </w:rPr>
-              <w:t xml:space="preserve">o: </w:t>
-            </w:r>
-            <w:r>
-              <w:rPr>
-                <w:color w:val="1A202C"/>
-                <w:sz w:val="20"/>
-              </w:rPr>
-              <w:t>Trư</w:t>
-            </w:r>
-            <w:r>
-              <w:rPr>
-                <w:color w:val="1A202C"/>
-                <w:sz w:val="20"/>
-              </w:rPr>
-              <w:t>ờ</w:t>
-            </w:r>
-            <w:r>
-              <w:rPr>
-                <w:color w:val="1A202C"/>
-                <w:sz w:val="20"/>
-              </w:rPr>
-              <w:t>ng Đ</w:t>
-            </w:r>
-            <w:r>
-              <w:rPr>
-                <w:color w:val="1A202C"/>
-                <w:sz w:val="20"/>
-              </w:rPr>
-              <w:t>ạ</w:t>
-            </w:r>
-            <w:r>
-              <w:rPr>
-                <w:color w:val="1A202C"/>
-                <w:sz w:val="20"/>
-              </w:rPr>
-              <w:t>i h</w:t>
-            </w:r>
-            <w:r>
-              <w:rPr>
-                <w:color w:val="1A202C"/>
-                <w:sz w:val="20"/>
-              </w:rPr>
-              <w:t>ọ</w:t>
-            </w:r>
-            <w:r>
-              <w:rPr>
-                <w:color w:val="1A202C"/>
-                <w:sz w:val="20"/>
-              </w:rPr>
-              <w:t>c Công Thương TP.HCM (HUIT)</w:t>
-            </w:r>
-          </w:p>
-          <w:p>
-            <w:pPr>
-              <w:spacing w:after="40" w:line="276" w:lineRule="auto"/>
-              <w:rPr>
-                <w:rFonts w:hint="eastAsia"/>
-              </w:rPr>
             </w:pPr>
             <w:r>
               <w:rPr>
@@ -383,167 +163,32 @@
                 <w:color w:val="1A202C"/>
                 <w:sz w:val="20"/>
               </w:rPr>
-              <w:t>Công ngh</w:t>
+              <w:t>Công nghệ Thông tin (Chuyên ngành Công nghệ Phần mềm)</w:t>
+            </w:r>
+          </w:p>
+          <w:p>
+            <w:pPr>
+              <w:spacing w:after="40" w:line="276" w:lineRule="auto"/>
+            </w:pPr>
+            <w:r>
+              <w:rPr>
+                <w:b/>
+                <w:sz w:val="20"/>
+              </w:rPr>
+              <w:t xml:space="preserve">•  Cú pháp định danh bài nộp: </w:t>
             </w:r>
             <w:r>
               <w:rPr>
                 <w:color w:val="1A202C"/>
                 <w:sz w:val="20"/>
               </w:rPr>
-              <w:t>ệ</w:t>
-            </w:r>
-            <w:r>
-              <w:rPr>
-                <w:color w:val="1A202C"/>
-                <w:sz w:val="20"/>
-              </w:rPr>
-              <w:t xml:space="preserve"> Thông tin (Chuyên ngành Công ngh</w:t>
-            </w:r>
-            <w:r>
-              <w:rPr>
-                <w:color w:val="1A202C"/>
-                <w:sz w:val="20"/>
-              </w:rPr>
-              <w:t>ệ</w:t>
-            </w:r>
-            <w:r>
-              <w:rPr>
-                <w:color w:val="1A202C"/>
-                <w:sz w:val="20"/>
-              </w:rPr>
-              <w:t xml:space="preserve"> Ph</w:t>
-            </w:r>
-            <w:r>
-              <w:rPr>
-                <w:color w:val="1A202C"/>
-                <w:sz w:val="20"/>
-              </w:rPr>
-              <w:t>ầ</w:t>
-            </w:r>
-            <w:r>
-              <w:rPr>
-                <w:color w:val="1A202C"/>
-                <w:sz w:val="20"/>
-              </w:rPr>
-              <w:t>n m</w:t>
-            </w:r>
-            <w:r>
-              <w:rPr>
-                <w:color w:val="1A202C"/>
-                <w:sz w:val="20"/>
-              </w:rPr>
-              <w:t>ề</w:t>
-            </w:r>
-            <w:r>
-              <w:rPr>
-                <w:color w:val="1A202C"/>
-                <w:sz w:val="20"/>
-              </w:rPr>
-              <w:t>m)</w:t>
-            </w:r>
-          </w:p>
-          <w:p>
-            <w:pPr>
-              <w:spacing w:after="40" w:line="276" w:lineRule="auto"/>
-              <w:rPr>
-                <w:rFonts w:hint="eastAsia"/>
-              </w:rPr>
-            </w:pPr>
-            <w:r>
-              <w:rPr>
-                <w:b/>
-                <w:sz w:val="20"/>
-              </w:rPr>
-              <w:t>•  Cú pháp đ</w:t>
-            </w:r>
-            <w:r>
-              <w:rPr>
-                <w:b/>
-                <w:sz w:val="20"/>
-              </w:rPr>
-              <w:t>ị</w:t>
-            </w:r>
-            <w:r>
-              <w:rPr>
-                <w:b/>
-                <w:sz w:val="20"/>
-              </w:rPr>
-              <w:t>nh danh bài n</w:t>
-            </w:r>
-            <w:r>
-              <w:rPr>
-                <w:b/>
-                <w:sz w:val="20"/>
-              </w:rPr>
-              <w:t>ộ</w:t>
-            </w:r>
-            <w:r>
-              <w:rPr>
-                <w:b/>
-                <w:sz w:val="20"/>
-              </w:rPr>
-              <w:t xml:space="preserve">p: </w:t>
-            </w:r>
-            <w:r>
-              <w:rPr>
-                <w:color w:val="1A202C"/>
-                <w:sz w:val="20"/>
-              </w:rPr>
-              <w:t>2627K1T5.16.358.Hoàng Kha - gi</w:t>
-            </w:r>
-            <w:r>
-              <w:rPr>
-                <w:color w:val="1A202C"/>
-                <w:sz w:val="20"/>
-              </w:rPr>
-              <w:t>ớ</w:t>
-            </w:r>
-            <w:r>
-              <w:rPr>
-                <w:color w:val="1A202C"/>
-                <w:sz w:val="20"/>
-              </w:rPr>
-              <w:t>i thi</w:t>
-            </w:r>
-            <w:r>
-              <w:rPr>
-                <w:color w:val="1A202C"/>
-                <w:sz w:val="20"/>
-              </w:rPr>
-              <w:t>ệ</w:t>
-            </w:r>
-            <w:r>
-              <w:rPr>
-                <w:color w:val="1A202C"/>
-                <w:sz w:val="20"/>
-              </w:rPr>
-              <w:t>u b</w:t>
-            </w:r>
-            <w:r>
-              <w:rPr>
-                <w:color w:val="1A202C"/>
-                <w:sz w:val="20"/>
-              </w:rPr>
-              <w:t>ả</w:t>
-            </w:r>
-            <w:r>
-              <w:rPr>
-                <w:color w:val="1A202C"/>
-                <w:sz w:val="20"/>
-              </w:rPr>
-              <w:t>n thân</w:t>
+              <w:t>2627K1T5.16.358.Hoàng Kha - giới thiệu bản thân</w:t>
             </w:r>
           </w:p>
         </w:tc>
       </w:tr>
     </w:tbl>
-    <w:p>
-      <w:pPr>
-        <w:rPr>
-          <w:rFonts w:hint="eastAsia"/>
-        </w:rPr>
-      </w:pPr>
-    </w:p>
+    <w:p/>
     <w:p>
       <w:pPr>
         <w:keepNext/>
@@ -551,9 +196,6 @@
           <w:bottom w:val="single" w:sz="12" w:space="4" w:color="3182CE"/>
         </w:pBdr>
         <w:spacing w:before="280" w:after="120"/>
-        <w:rPr>
-          <w:rFonts w:hint="eastAsia"/>
-        </w:rPr>
       </w:pPr>
       <w:r>
         <w:rPr>
@@ -561,78 +203,15 @@
           <w:color w:val="1A365D"/>
           <w:sz w:val="28"/>
         </w:rPr>
-        <w:t>1. Gi</w:t>
-      </w:r>
-      <w:r>
-        <w:rPr>
-          <w:b/>
-          <w:color w:val="1A365D"/>
-          <w:sz w:val="28"/>
-        </w:rPr>
-        <w:t>ớ</w:t>
-      </w:r>
-      <w:r>
-        <w:rPr>
-          <w:b/>
-          <w:color w:val="1A365D"/>
-          <w:sz w:val="28"/>
-        </w:rPr>
-        <w:t>i thi</w:t>
-      </w:r>
-      <w:r>
-        <w:rPr>
-          <w:b/>
-          <w:color w:val="1A365D"/>
-          <w:sz w:val="28"/>
-        </w:rPr>
-        <w:t>ệ</w:t>
-      </w:r>
-      <w:r>
-        <w:rPr>
-          <w:b/>
-          <w:color w:val="1A365D"/>
-          <w:sz w:val="28"/>
-        </w:rPr>
-        <w:t>u b</w:t>
-      </w:r>
-      <w:r>
-        <w:rPr>
-          <w:b/>
-          <w:color w:val="1A365D"/>
-          <w:sz w:val="28"/>
-        </w:rPr>
-        <w:t>ả</w:t>
-      </w:r>
-      <w:r>
-        <w:rPr>
-          <w:b/>
-          <w:color w:val="1A365D"/>
-          <w:sz w:val="28"/>
-        </w:rPr>
-        <w:t>n thân</w:t>
+        <w:t>1. Giới thiệu bản thân</w:t>
       </w:r>
     </w:p>
     <w:p>
       <w:pPr>
         <w:spacing w:after="120"/>
-        <w:rPr>
-          <w:rFonts w:hint="eastAsia"/>
-        </w:rPr>
       </w:pPr>
       <w:r>
-        <w:t>Xin chào Th</w:t>
-      </w:r>
-      <w:r>
-        <w:t>ầ</w:t>
-      </w:r>
-      <w:r>
-        <w:t>y/Cô và các b</w:t>
-      </w:r>
-      <w:r>
-        <w:t>ạ</w:t>
-      </w:r>
-      <w:r>
-        <w:t xml:space="preserve">n! Em tên là </w:t>
+        <w:t xml:space="preserve">Xin chào Thầy/Cô và các bạn! Em tên là </w:t>
       </w:r>
       <w:r>
         <w:rPr>
@@ -641,363 +220,24 @@
         <w:t>Ngô Hoàng Kha</w:t>
       </w:r>
       <w:r>
-        <w:t>, hi</w:t>
-      </w:r>
-      <w:r>
-        <w:t>ệ</w:t>
-      </w:r>
-      <w:r>
-        <w:t>n là sinh viên chuyên ngà</w:t>
-      </w:r>
-      <w:r>
-        <w:t>nh Công ngh</w:t>
-      </w:r>
-      <w:r>
-        <w:t>ệ</w:t>
-      </w:r>
-      <w:r>
-        <w:t xml:space="preserve"> Thông tin t</w:t>
-      </w:r>
-      <w:r>
-        <w:t>ạ</w:t>
-      </w:r>
-      <w:r>
-        <w:t xml:space="preserve">i </w:t>
+        <w:t xml:space="preserve">, hiện là sinh viên chuyên ngành Công nghệ Thông tin tại </w:t>
       </w:r>
       <w:r>
         <w:rPr>
           <w:b/>
         </w:rPr>
-        <w:t>Trư</w:t>
+        <w:t>Trường Đại học Công Thương TP.HCM (HUIT)</w:t>
       </w:r>
       <w:r>
-        <w:rPr>
-          <w:b/>
-        </w:rPr>
-        <w:t>ờ</w:t>
-      </w:r>
-      <w:r>
-        <w:rPr>
-          <w:b/>
-        </w:rPr>
-        <w:t>ng Đ</w:t>
-      </w:r>
-      <w:r>
-        <w:rPr>
-          <w:b/>
-        </w:rPr>
-        <w:t>ạ</w:t>
-      </w:r>
-      <w:r>
-        <w:rPr>
-          <w:b/>
-        </w:rPr>
-        <w:t>i h</w:t>
-      </w:r>
-      <w:r>
-        <w:rPr>
-          <w:b/>
-        </w:rPr>
-        <w:t>ọ</w:t>
-      </w:r>
-      <w:r>
-        <w:rPr>
-          <w:b/>
-        </w:rPr>
-        <w:t>c Công Thương TP.HCM (HUIT)</w:t>
-      </w:r>
-      <w:r>
-        <w:t>. B</w:t>
-      </w:r>
-      <w:r>
-        <w:t>ả</w:t>
-      </w:r>
-      <w:r>
-        <w:t>n thân em có đ</w:t>
-      </w:r>
-      <w:r>
-        <w:t>ị</w:t>
-      </w:r>
-      <w:r>
-        <w:t>nh hư</w:t>
-      </w:r>
-      <w:r>
-        <w:t>ớ</w:t>
-      </w:r>
-      <w:r>
-        <w:t>ng tr</w:t>
-      </w:r>
-      <w:r>
-        <w:t>ở</w:t>
-      </w:r>
-      <w:r>
-        <w:t xml:space="preserve"> thành m</w:t>
-      </w:r>
-      <w:r>
-        <w:t>ộ</w:t>
-      </w:r>
-      <w:r>
-        <w:t>t K</w:t>
-      </w:r>
-      <w:r>
-        <w:t>ỹ</w:t>
-      </w:r>
-      <w:r>
-        <w:t xml:space="preserve"> sư Ph</w:t>
-      </w:r>
-      <w:r>
-        <w:t>ầ</w:t>
-      </w:r>
-      <w:r>
-        <w:t>n m</w:t>
-      </w:r>
-      <w:r>
-        <w:t>ề</w:t>
-      </w:r>
-      <w:r>
-        <w:t>m (Software Engineer) và Nhà phân tích H</w:t>
-      </w:r>
-      <w:r>
-        <w:t>ệ</w:t>
-      </w:r>
-      <w:r>
-        <w:t xml:space="preserve"> th</w:t>
-      </w:r>
-      <w:r>
-        <w:t>ố</w:t>
-      </w:r>
-      <w:r>
-        <w:t>ng trong tương lai.</w:t>
+        <w:t>. Bản thân em có định hướng trở thành một Kỹ sư Phần mềm (Software Engineer) và Nhà phân tích Hệ thống trong tương lai.</w:t>
       </w:r>
     </w:p>
     <w:p>
       <w:pPr>
         <w:spacing w:after="160"/>
-        <w:rPr>
-          <w:rFonts w:hint="eastAsia"/>
-        </w:rPr>
       </w:pPr>
       <w:r>
-        <w:t>Trong quá trình h</w:t>
-      </w:r>
-      <w:r>
-        <w:t>ọ</w:t>
-      </w:r>
-      <w:r>
-        <w:t>c t</w:t>
-      </w:r>
-      <w:r>
-        <w:t>ậ</w:t>
-      </w:r>
-      <w:r>
-        <w:t>p t</w:t>
-      </w:r>
-      <w:r>
-        <w:t>ạ</w:t>
-      </w:r>
-      <w:r>
-        <w:t>i HUIT, em luôn ch</w:t>
-      </w:r>
-      <w:r>
-        <w:t>ủ</w:t>
-      </w:r>
-      <w:r>
-        <w:t xml:space="preserve"> đ</w:t>
-      </w:r>
-      <w:r>
-        <w:t>ộ</w:t>
-      </w:r>
-      <w:r>
-        <w:t>ng tìm tòi ki</w:t>
-      </w:r>
-      <w:r>
-        <w:t>ế</w:t>
-      </w:r>
-      <w:r>
-        <w:t>n th</w:t>
-      </w:r>
-      <w:r>
-        <w:t>ứ</w:t>
-      </w:r>
-      <w:r>
-        <w:t xml:space="preserve">c </w:t>
-      </w:r>
-      <w:r>
-        <w:t>v</w:t>
-      </w:r>
-      <w:r>
-        <w:t>ề</w:t>
-      </w:r>
-      <w:r>
-        <w:t xml:space="preserve"> l</w:t>
-      </w:r>
-      <w:r>
-        <w:t>ậ</w:t>
-      </w:r>
-      <w:r>
-        <w:t>p trình hư</w:t>
-      </w:r>
-      <w:r>
-        <w:t>ớ</w:t>
-      </w:r>
-      <w:r>
-        <w:t>ng đ</w:t>
-      </w:r>
-      <w:r>
-        <w:t>ố</w:t>
-      </w:r>
-      <w:r>
-        <w:t>i tư</w:t>
-      </w:r>
-      <w:r>
-        <w:t>ợ</w:t>
-      </w:r>
-      <w:r>
-        <w:t>ng, thi</w:t>
-      </w:r>
-      <w:r>
-        <w:t>ế</w:t>
-      </w:r>
-      <w:r>
-        <w:t>t k</w:t>
-      </w:r>
-      <w:r>
-        <w:t>ế</w:t>
-      </w:r>
-      <w:r>
-        <w:t xml:space="preserve"> cơ s</w:t>
-      </w:r>
-      <w:r>
-        <w:t>ở</w:t>
-      </w:r>
-      <w:r>
-        <w:t xml:space="preserve"> d</w:t>
-      </w:r>
-      <w:r>
-        <w:t>ữ</w:t>
-      </w:r>
-      <w:r>
-        <w:t xml:space="preserve"> li</w:t>
-      </w:r>
-      <w:r>
-        <w:t>ệ</w:t>
-      </w:r>
-      <w:r>
-        <w:t>u và xây d</w:t>
-      </w:r>
-      <w:r>
-        <w:t>ự</w:t>
-      </w:r>
-      <w:r>
-        <w:t>ng ki</w:t>
-      </w:r>
-      <w:r>
-        <w:t>ế</w:t>
-      </w:r>
-      <w:r>
-        <w:t>n trúc h</w:t>
-      </w:r>
-      <w:r>
-        <w:t>ệ</w:t>
-      </w:r>
-      <w:r>
-        <w:t xml:space="preserve"> th</w:t>
-      </w:r>
-      <w:r>
-        <w:t>ố</w:t>
-      </w:r>
-      <w:r>
-        <w:t>ng m</w:t>
-      </w:r>
-      <w:r>
-        <w:t>ạ</w:t>
-      </w:r>
-      <w:r>
-        <w:t>ng. Em yêu thích vi</w:t>
-      </w:r>
-      <w:r>
-        <w:t>ệ</w:t>
-      </w:r>
-      <w:r>
-        <w:t>c gi</w:t>
-      </w:r>
-      <w:r>
-        <w:t>ả</w:t>
-      </w:r>
-      <w:r>
-        <w:t>i quy</w:t>
-      </w:r>
-      <w:r>
-        <w:t>ế</w:t>
-      </w:r>
-      <w:r>
-        <w:t>t các bài toán th</w:t>
-      </w:r>
-      <w:r>
-        <w:t>ự</w:t>
-      </w:r>
-      <w:r>
-        <w:t>c t</w:t>
-      </w:r>
-      <w:r>
-        <w:t>ế</w:t>
-      </w:r>
-      <w:r>
-        <w:t xml:space="preserve"> thông qua mã ngu</w:t>
-      </w:r>
-      <w:r>
-        <w:t>ồ</w:t>
-      </w:r>
-      <w:r>
-        <w:t>n s</w:t>
-      </w:r>
-      <w:r>
-        <w:t>ạ</w:t>
-      </w:r>
-      <w:r>
-        <w:t>ch (Clean Code), mô hình hóa d</w:t>
-      </w:r>
-      <w:r>
-        <w:t>ữ</w:t>
-      </w:r>
-      <w:r>
-        <w:t xml:space="preserve"> li</w:t>
-      </w:r>
-      <w:r>
-        <w:t>ệ</w:t>
-      </w:r>
-      <w:r>
-        <w:t>u chu</w:t>
-      </w:r>
-      <w:r>
-        <w:t>ẩ</w:t>
-      </w:r>
-      <w:r>
-        <w:t>n hóa và t</w:t>
-      </w:r>
-      <w:r>
-        <w:t>ố</w:t>
-      </w:r>
-      <w:r>
-        <w:t>i ưu hóa hi</w:t>
-      </w:r>
-      <w:r>
-        <w:t>ệ</w:t>
-      </w:r>
-      <w:r>
-        <w:t xml:space="preserve">u năng </w:t>
-      </w:r>
-      <w:r>
-        <w:t>ứ</w:t>
-      </w:r>
-      <w:r>
-        <w:t>ng d</w:t>
-      </w:r>
-      <w:r>
-        <w:t>ụ</w:t>
-      </w:r>
-      <w:r>
-        <w:t>ng.</w:t>
+        <w:t>Trong quá trình học tập tại HUIT, em luôn chủ động tìm tòi kiến thức về lập trình hướng đối tượng, thiết kế cơ sở dữ liệu và xây dựng kiến trúc hệ thống mạng. Em yêu thích việc giải quyết các bài toán thực tế thông qua mã nguồn sạch (Clean Code), mô hình hóa dữ liệu chuẩn hóa và tối ưu hóa hiệu năng ứng dụng.</w:t>
       </w:r>
     </w:p>
     <w:p>
@@ -1007,9 +247,6 @@
           <w:bottom w:val="single" w:sz="12" w:space="4" w:color="3182CE"/>
         </w:pBdr>
         <w:spacing w:before="280" w:after="120"/>
-        <w:rPr>
-          <w:rFonts w:hint="eastAsia"/>
-        </w:rPr>
       </w:pPr>
       <w:r>
         <w:rPr>
@@ -1017,835 +254,73 @@
           <w:color w:val="1A365D"/>
           <w:sz w:val="28"/>
         </w:rPr>
-        <w:t>2. Các môn h</w:t>
-      </w:r>
-      <w:r>
-        <w:rPr>
-          <w:b/>
-          <w:color w:val="1A365D"/>
-          <w:sz w:val="28"/>
-        </w:rPr>
-        <w:t>ọ</w:t>
-      </w:r>
-      <w:r>
-        <w:rPr>
-          <w:b/>
-          <w:color w:val="1A365D"/>
-          <w:sz w:val="28"/>
-        </w:rPr>
-        <w:t>c</w:t>
-      </w:r>
-      <w:r>
-        <w:rPr>
-          <w:b/>
-          <w:color w:val="1A365D"/>
-          <w:sz w:val="28"/>
-        </w:rPr>
-        <w:t xml:space="preserve"> yêu thích</w:t>
+        <w:t>2. Các môn học yêu thích</w:t>
       </w:r>
     </w:p>
     <w:p>
       <w:pPr>
         <w:ind w:left="288"/>
-        <w:rPr>
-          <w:rFonts w:hint="eastAsia"/>
-        </w:rPr>
       </w:pPr>
       <w:r>
         <w:rPr>
           <w:b/>
           <w:color w:val="2B6CB0"/>
         </w:rPr>
-        <w:t>🔹</w:t>
+        <w:t xml:space="preserve">🔹 Lập trình Java &amp; Phát triển Ứng dụng: </w:t>
       </w:r>
       <w:r>
-        <w:rPr>
-          <w:b/>
-          <w:color w:val="2B6CB0"/>
-        </w:rPr>
-        <w:t xml:space="preserve"> L</w:t>
-      </w:r>
-      <w:r>
-        <w:rPr>
-          <w:b/>
-          <w:color w:val="2B6CB0"/>
-        </w:rPr>
-        <w:t>ậ</w:t>
-      </w:r>
-      <w:r>
-        <w:rPr>
-          <w:b/>
-          <w:color w:val="2B6CB0"/>
-        </w:rPr>
-        <w:t>p trình Java &amp; Phát tri</w:t>
-      </w:r>
-      <w:r>
-        <w:rPr>
-          <w:b/>
-          <w:color w:val="2B6CB0"/>
-        </w:rPr>
-        <w:t>ể</w:t>
-      </w:r>
-      <w:r>
-        <w:rPr>
-          <w:b/>
-          <w:color w:val="2B6CB0"/>
-        </w:rPr>
-        <w:t xml:space="preserve">n </w:t>
-      </w:r>
-      <w:r>
-        <w:rPr>
-          <w:b/>
-          <w:color w:val="2B6CB0"/>
-        </w:rPr>
-        <w:t>Ứ</w:t>
-      </w:r>
-      <w:r>
-        <w:rPr>
-          <w:b/>
-          <w:color w:val="2B6CB0"/>
-        </w:rPr>
-        <w:t>ng d</w:t>
-      </w:r>
-      <w:r>
-        <w:rPr>
-          <w:b/>
-          <w:color w:val="2B6CB0"/>
-        </w:rPr>
-        <w:t>ụ</w:t>
-      </w:r>
-      <w:r>
-        <w:rPr>
-          <w:b/>
-          <w:color w:val="2B6CB0"/>
-        </w:rPr>
-        <w:t xml:space="preserve">ng: </w:t>
-      </w:r>
-      <w:r>
-        <w:t>Trang b</w:t>
-      </w:r>
-      <w:r>
-        <w:t>ị</w:t>
-      </w:r>
-      <w:r>
-        <w:t xml:space="preserve"> n</w:t>
-      </w:r>
-      <w:r>
-        <w:t>ề</w:t>
-      </w:r>
-      <w:r>
-        <w:t>n t</w:t>
-      </w:r>
-      <w:r>
-        <w:t>ả</w:t>
-      </w:r>
-      <w:r>
-        <w:t>ng v</w:t>
-      </w:r>
-      <w:r>
-        <w:t>ữ</w:t>
-      </w:r>
-      <w:r>
-        <w:t>ng ch</w:t>
-      </w:r>
-      <w:r>
-        <w:t>ắ</w:t>
-      </w:r>
-      <w:r>
-        <w:t>c v</w:t>
-      </w:r>
-      <w:r>
-        <w:t>ề</w:t>
-      </w:r>
-      <w:r>
-        <w:t xml:space="preserve"> l</w:t>
-      </w:r>
-      <w:r>
-        <w:t>ậ</w:t>
-      </w:r>
-      <w:r>
-        <w:t>p trình hư</w:t>
-      </w:r>
-      <w:r>
-        <w:t>ớ</w:t>
-      </w:r>
-      <w:r>
-        <w:t>ng đ</w:t>
-      </w:r>
-      <w:r>
-        <w:t>ố</w:t>
-      </w:r>
-      <w:r>
-        <w:t>i tư</w:t>
-      </w:r>
-      <w:r>
-        <w:t>ợ</w:t>
-      </w:r>
-      <w:r>
-        <w:t>ng (OOP), các Design Patterns thông d</w:t>
-      </w:r>
-      <w:r>
-        <w:t>ụ</w:t>
-      </w:r>
-      <w:r>
-        <w:t>ng, xây d</w:t>
-      </w:r>
-      <w:r>
-        <w:t>ự</w:t>
-      </w:r>
-      <w:r>
-        <w:t>ng giao di</w:t>
-      </w:r>
-      <w:r>
-        <w:t>ệ</w:t>
-      </w:r>
-      <w:r>
-        <w:t>n ngư</w:t>
-      </w:r>
-      <w:r>
-        <w:t>ờ</w:t>
-      </w:r>
-      <w:r>
-        <w:t>i dùng b</w:t>
-      </w:r>
-      <w:r>
-        <w:t>ằ</w:t>
-      </w:r>
-      <w:r>
-        <w:t>ng Swing/AWT trên môi trư</w:t>
-      </w:r>
-      <w:r>
-        <w:t>ờ</w:t>
-      </w:r>
-      <w:r>
-        <w:t>ng NetBeans IDE và k</w:t>
-      </w:r>
-      <w:r>
-        <w:t>ế</w:t>
-      </w:r>
-      <w:r>
-        <w:t>t n</w:t>
-      </w:r>
-      <w:r>
-        <w:t>ố</w:t>
-      </w:r>
-      <w:r>
-        <w:t>i cơ s</w:t>
-      </w:r>
-      <w:r>
-        <w:t>ở</w:t>
-      </w:r>
-      <w:r>
-        <w:t xml:space="preserve"> d</w:t>
-      </w:r>
-      <w:r>
-        <w:t>ữ</w:t>
-      </w:r>
-      <w:r>
-        <w:t xml:space="preserve"> li</w:t>
-      </w:r>
-      <w:r>
-        <w:t>ệ</w:t>
-      </w:r>
-      <w:r>
-        <w:t xml:space="preserve">u qua </w:t>
-      </w:r>
-      <w:r>
-        <w:t>JDBC.</w:t>
+        <w:t>Trang bị nền tảng vững chắc về lập trình hướng đối tượng (OOP), các Design Patterns thông dụng, xây dựng giao diện người dùng bằng Swing/AWT trên môi trường NetBeans IDE và kết nối cơ sở dữ liệu qua JDBC.</w:t>
       </w:r>
     </w:p>
     <w:p>
       <w:pPr>
         <w:ind w:left="288"/>
-        <w:rPr>
-          <w:rFonts w:hint="eastAsia"/>
-        </w:rPr>
       </w:pPr>
       <w:r>
         <w:rPr>
           <w:b/>
           <w:color w:val="2B6CB0"/>
         </w:rPr>
-        <w:t>🔹</w:t>
+        <w:t xml:space="preserve">🔹 Thiết kế &amp; Quản trị Cơ sở Dữ liệu (MS SQL Server): </w:t>
       </w:r>
       <w:r>
-        <w:rPr>
-          <w:b/>
-          <w:color w:val="2B6CB0"/>
-        </w:rPr>
-        <w:t xml:space="preserve"> Thi</w:t>
-      </w:r>
-      <w:r>
-        <w:rPr>
-          <w:b/>
-          <w:color w:val="2B6CB0"/>
-        </w:rPr>
-        <w:t>ế</w:t>
-      </w:r>
-      <w:r>
-        <w:rPr>
-          <w:b/>
-          <w:color w:val="2B6CB0"/>
-        </w:rPr>
-        <w:t>t k</w:t>
-      </w:r>
-      <w:r>
-        <w:rPr>
-          <w:b/>
-          <w:color w:val="2B6CB0"/>
-        </w:rPr>
-        <w:t>ế</w:t>
-      </w:r>
-      <w:r>
-        <w:rPr>
-          <w:b/>
-          <w:color w:val="2B6CB0"/>
-        </w:rPr>
-        <w:t xml:space="preserve"> &amp; Qu</w:t>
-      </w:r>
-      <w:r>
-        <w:rPr>
-          <w:b/>
-          <w:color w:val="2B6CB0"/>
-        </w:rPr>
-        <w:t>ả</w:t>
-      </w:r>
-      <w:r>
-        <w:rPr>
-          <w:b/>
-          <w:color w:val="2B6CB0"/>
-        </w:rPr>
-        <w:t>n tr</w:t>
-      </w:r>
-      <w:r>
-        <w:rPr>
-          <w:b/>
-          <w:color w:val="2B6CB0"/>
-        </w:rPr>
-        <w:t>ị</w:t>
-      </w:r>
-      <w:r>
-        <w:rPr>
-          <w:b/>
-          <w:color w:val="2B6CB0"/>
-        </w:rPr>
-        <w:t xml:space="preserve"> Cơ s</w:t>
-      </w:r>
-      <w:r>
-        <w:rPr>
-          <w:b/>
-          <w:color w:val="2B6CB0"/>
-        </w:rPr>
-        <w:t>ở</w:t>
-      </w:r>
-      <w:r>
-        <w:rPr>
-          <w:b/>
-          <w:color w:val="2B6CB0"/>
-        </w:rPr>
-        <w:t xml:space="preserve"> D</w:t>
-      </w:r>
-      <w:r>
-        <w:rPr>
-          <w:b/>
-          <w:color w:val="2B6CB0"/>
-        </w:rPr>
-        <w:t>ữ</w:t>
-      </w:r>
-      <w:r>
-        <w:rPr>
-          <w:b/>
-          <w:color w:val="2B6CB0"/>
-        </w:rPr>
-        <w:t xml:space="preserve"> li</w:t>
-      </w:r>
-      <w:r>
-        <w:rPr>
-          <w:b/>
-          <w:color w:val="2B6CB0"/>
-        </w:rPr>
-        <w:t>ệ</w:t>
-      </w:r>
-      <w:r>
-        <w:rPr>
-          <w:b/>
-          <w:color w:val="2B6CB0"/>
-        </w:rPr>
-        <w:t xml:space="preserve">u (MS SQL Server): </w:t>
-      </w:r>
-      <w:r>
-        <w:t>Rèn luy</w:t>
-      </w:r>
-      <w:r>
-        <w:t>ệ</w:t>
-      </w:r>
-      <w:r>
-        <w:t>n k</w:t>
-      </w:r>
-      <w:r>
-        <w:t>ỹ</w:t>
-      </w:r>
-      <w:r>
-        <w:t xml:space="preserve"> năng mô hình hóa d</w:t>
-      </w:r>
-      <w:r>
-        <w:t>ữ</w:t>
-      </w:r>
-      <w:r>
-        <w:t xml:space="preserve"> li</w:t>
-      </w:r>
-      <w:r>
-        <w:t>ệ</w:t>
-      </w:r>
-      <w:r>
-        <w:t>u t</w:t>
-      </w:r>
-      <w:r>
-        <w:t>ừ</w:t>
-      </w:r>
-      <w:r>
-        <w:t xml:space="preserve"> Mô hình Quan ni</w:t>
-      </w:r>
-      <w:r>
-        <w:t>ệ</w:t>
-      </w:r>
-      <w:r>
-        <w:t>m (CDM) sang Mô hình V</w:t>
-      </w:r>
-      <w:r>
-        <w:t>ậ</w:t>
-      </w:r>
-      <w:r>
-        <w:t>t lý (PDM), vi</w:t>
-      </w:r>
-      <w:r>
-        <w:t>ế</w:t>
-      </w:r>
-      <w:r>
-        <w:t>t truy v</w:t>
-      </w:r>
-      <w:r>
-        <w:t>ấ</w:t>
-      </w:r>
-      <w:r>
-        <w:t>n T-SQL ph</w:t>
-      </w:r>
-      <w:r>
-        <w:t>ứ</w:t>
-      </w:r>
-      <w:r>
-        <w:t>c t</w:t>
-      </w:r>
-      <w:r>
-        <w:t>ạ</w:t>
-      </w:r>
-      <w:r>
-        <w:t>p, Trigger, Stored Procedure, Indexing và t</w:t>
-      </w:r>
-      <w:r>
-        <w:t>ố</w:t>
-      </w:r>
-      <w:r>
-        <w:t>i ưu hóa hi</w:t>
-      </w:r>
-      <w:r>
-        <w:t>ệ</w:t>
-      </w:r>
-      <w:r>
-        <w:t>u năng cho h</w:t>
-      </w:r>
-      <w:r>
-        <w:t>ệ</w:t>
-      </w:r>
-      <w:r>
-        <w:t xml:space="preserve"> th</w:t>
-      </w:r>
-      <w:r>
-        <w:t>ố</w:t>
-      </w:r>
-      <w:r>
-        <w:t>ng c</w:t>
-      </w:r>
-      <w:r>
-        <w:t>ơ s</w:t>
-      </w:r>
-      <w:r>
-        <w:t>ở</w:t>
-      </w:r>
-      <w:r>
-        <w:t xml:space="preserve"> d</w:t>
-      </w:r>
-      <w:r>
-        <w:t>ữ</w:t>
-      </w:r>
-      <w:r>
-        <w:t xml:space="preserve"> li</w:t>
-      </w:r>
-      <w:r>
-        <w:t>ệ</w:t>
-      </w:r>
-      <w:r>
-        <w:t>u l</w:t>
-      </w:r>
-      <w:r>
-        <w:t>ớ</w:t>
-      </w:r>
-      <w:r>
-        <w:t>n.</w:t>
+        <w:t>Rèn luyện kỹ năng mô hình hóa dữ liệu từ Mô hình Quan niệm (CDM) sang Mô hình Vật lý (PDM), viết truy vấn T-SQL phức tạp, Trigger, Stored Procedure, Indexing và tối ưu hóa hiệu năng cho hệ thống cơ sở dữ liệu lớn.</w:t>
       </w:r>
     </w:p>
     <w:p>
       <w:pPr>
         <w:ind w:left="288"/>
-        <w:rPr>
-          <w:rFonts w:hint="eastAsia"/>
-        </w:rPr>
       </w:pPr>
       <w:r>
         <w:rPr>
           <w:b/>
           <w:color w:val="2B6CB0"/>
         </w:rPr>
-        <w:t>🔹</w:t>
+        <w:t xml:space="preserve">🔹 Phân tích &amp; Thiết kế Hệ thống: </w:t>
       </w:r>
       <w:r>
-        <w:rPr>
-          <w:b/>
-          <w:color w:val="2B6CB0"/>
-        </w:rPr>
-        <w:t xml:space="preserve"> Phân tích &amp; Thi</w:t>
-      </w:r>
-      <w:r>
-        <w:rPr>
-          <w:b/>
-          <w:color w:val="2B6CB0"/>
-        </w:rPr>
-        <w:t>ế</w:t>
-      </w:r>
-      <w:r>
-        <w:rPr>
-          <w:b/>
-          <w:color w:val="2B6CB0"/>
-        </w:rPr>
-        <w:t>t k</w:t>
-      </w:r>
-      <w:r>
-        <w:rPr>
-          <w:b/>
-          <w:color w:val="2B6CB0"/>
-        </w:rPr>
-        <w:t>ế</w:t>
-      </w:r>
-      <w:r>
-        <w:rPr>
-          <w:b/>
-          <w:color w:val="2B6CB0"/>
-        </w:rPr>
-        <w:t xml:space="preserve"> H</w:t>
-      </w:r>
-      <w:r>
-        <w:rPr>
-          <w:b/>
-          <w:color w:val="2B6CB0"/>
-        </w:rPr>
-        <w:t>ệ</w:t>
-      </w:r>
-      <w:r>
-        <w:rPr>
-          <w:b/>
-          <w:color w:val="2B6CB0"/>
-        </w:rPr>
-        <w:t xml:space="preserve"> th</w:t>
-      </w:r>
-      <w:r>
-        <w:rPr>
-          <w:b/>
-          <w:color w:val="2B6CB0"/>
-        </w:rPr>
-        <w:t>ố</w:t>
-      </w:r>
-      <w:r>
-        <w:rPr>
-          <w:b/>
-          <w:color w:val="2B6CB0"/>
-        </w:rPr>
-        <w:t xml:space="preserve">ng: </w:t>
-      </w:r>
-      <w:r>
-        <w:t>Cung c</w:t>
-      </w:r>
-      <w:r>
-        <w:t>ấ</w:t>
-      </w:r>
-      <w:r>
-        <w:t>p tư duy h</w:t>
-      </w:r>
-      <w:r>
-        <w:t>ệ</w:t>
-      </w:r>
-      <w:r>
-        <w:t xml:space="preserve"> th</w:t>
-      </w:r>
-      <w:r>
-        <w:t>ố</w:t>
-      </w:r>
-      <w:r>
-        <w:t>ng toàn di</w:t>
-      </w:r>
-      <w:r>
-        <w:t>ệ</w:t>
-      </w:r>
-      <w:r>
-        <w:t>n, k</w:t>
-      </w:r>
-      <w:r>
-        <w:t>ỹ</w:t>
-      </w:r>
-      <w:r>
-        <w:t xml:space="preserve"> năng kh</w:t>
-      </w:r>
-      <w:r>
-        <w:t>ả</w:t>
-      </w:r>
-      <w:r>
-        <w:t>o sát yêu c</w:t>
-      </w:r>
-      <w:r>
-        <w:t>ầ</w:t>
-      </w:r>
-      <w:r>
-        <w:t>u ph</w:t>
-      </w:r>
-      <w:r>
-        <w:t>ầ</w:t>
-      </w:r>
-      <w:r>
-        <w:t>n m</w:t>
-      </w:r>
-      <w:r>
-        <w:t>ề</w:t>
-      </w:r>
-      <w:r>
-        <w:t>m, v</w:t>
-      </w:r>
-      <w:r>
-        <w:t>ẽ</w:t>
-      </w:r>
-      <w:r>
-        <w:t xml:space="preserve"> bi</w:t>
-      </w:r>
-      <w:r>
-        <w:t>ể</w:t>
-      </w:r>
-      <w:r>
-        <w:t>u đ</w:t>
-      </w:r>
-      <w:r>
-        <w:t>ồ</w:t>
-      </w:r>
-      <w:r>
-        <w:t xml:space="preserve"> UML (Use Case, Sequence, Class Diagram) và thi</w:t>
-      </w:r>
-      <w:r>
-        <w:t>ế</w:t>
-      </w:r>
-      <w:r>
-        <w:t>t k</w:t>
-      </w:r>
-      <w:r>
-        <w:t>ế</w:t>
-      </w:r>
-      <w:r>
-        <w:t xml:space="preserve"> ki</w:t>
-      </w:r>
-      <w:r>
-        <w:t>ế</w:t>
-      </w:r>
-      <w:r>
-        <w:t>n trúc ph</w:t>
-      </w:r>
-      <w:r>
-        <w:t>ầ</w:t>
-      </w:r>
-      <w:r>
-        <w:t>n m</w:t>
-      </w:r>
-      <w:r>
-        <w:t>ề</w:t>
-      </w:r>
-      <w:r>
-        <w:t xml:space="preserve">m đáp </w:t>
-      </w:r>
-      <w:r>
-        <w:t>ứ</w:t>
-      </w:r>
-      <w:r>
-        <w:t>ng nhu c</w:t>
-      </w:r>
-      <w:r>
-        <w:t>ầ</w:t>
-      </w:r>
-      <w:r>
-        <w:t>u th</w:t>
-      </w:r>
-      <w:r>
-        <w:t>ự</w:t>
-      </w:r>
-      <w:r>
-        <w:t>c t</w:t>
-      </w:r>
-      <w:r>
-        <w:t>ế</w:t>
-      </w:r>
-      <w:r>
-        <w:t xml:space="preserve"> c</w:t>
-      </w:r>
-      <w:r>
-        <w:t>ủ</w:t>
-      </w:r>
-      <w:r>
-        <w:t>a doanh nghi</w:t>
-      </w:r>
-      <w:r>
-        <w:t>ệ</w:t>
-      </w:r>
-      <w:r>
-        <w:t>p.</w:t>
+        <w:t>Cung cấp tư duy hệ thống toàn diện, kỹ năng khảo sát yêu cầu phần mềm, vẽ biểu đồ UML (Use Case, Sequence, Class Diagram) và thiết kế kiến trúc phần mềm đáp ứng nhu cầu thực tế của doanh nghiệp.</w:t>
       </w:r>
     </w:p>
     <w:p>
       <w:pPr>
         <w:ind w:left="288"/>
-        <w:rPr>
-          <w:rFonts w:hint="eastAsia"/>
-        </w:rPr>
       </w:pPr>
       <w:r>
         <w:rPr>
           <w:b/>
           <w:color w:val="2B6CB0"/>
         </w:rPr>
-        <w:t>🔹</w:t>
+        <w:t xml:space="preserve">🔹 Mạng Máy tính &amp; Công nghệ Mail Server: </w:t>
       </w:r>
       <w:r>
-        <w:rPr>
-          <w:b/>
-          <w:color w:val="2B6CB0"/>
-        </w:rPr>
-        <w:t xml:space="preserve"> M</w:t>
-      </w:r>
-      <w:r>
-        <w:rPr>
-          <w:b/>
-          <w:color w:val="2B6CB0"/>
-        </w:rPr>
-        <w:t>ạ</w:t>
-      </w:r>
-      <w:r>
-        <w:rPr>
-          <w:b/>
-          <w:color w:val="2B6CB0"/>
-        </w:rPr>
-        <w:t>ng M</w:t>
-      </w:r>
-      <w:r>
-        <w:rPr>
-          <w:b/>
-          <w:color w:val="2B6CB0"/>
-        </w:rPr>
-        <w:t>áy tính &amp; Công ngh</w:t>
-      </w:r>
-      <w:r>
-        <w:rPr>
-          <w:b/>
-          <w:color w:val="2B6CB0"/>
-        </w:rPr>
-        <w:t>ệ</w:t>
-      </w:r>
-      <w:r>
-        <w:rPr>
-          <w:b/>
-          <w:color w:val="2B6CB0"/>
-        </w:rPr>
-        <w:t xml:space="preserve"> Mail Server: </w:t>
-      </w:r>
-      <w:r>
-        <w:t>Nghiên c</w:t>
-      </w:r>
-      <w:r>
-        <w:t>ứ</w:t>
-      </w:r>
-      <w:r>
-        <w:t>u mô hình OSI/TCP-IP, c</w:t>
-      </w:r>
-      <w:r>
-        <w:t>ấ</w:t>
-      </w:r>
-      <w:r>
-        <w:t>u hình d</w:t>
-      </w:r>
-      <w:r>
-        <w:t>ị</w:t>
-      </w:r>
-      <w:r>
-        <w:t>ch v</w:t>
-      </w:r>
-      <w:r>
-        <w:t>ụ</w:t>
-      </w:r>
-      <w:r>
-        <w:t xml:space="preserve"> m</w:t>
-      </w:r>
-      <w:r>
-        <w:t>ạ</w:t>
-      </w:r>
-      <w:r>
-        <w:t>ng doanh nghi</w:t>
-      </w:r>
-      <w:r>
-        <w:t>ệ</w:t>
-      </w:r>
-      <w:r>
-        <w:t>p, tri</w:t>
-      </w:r>
-      <w:r>
-        <w:t>ể</w:t>
-      </w:r>
-      <w:r>
-        <w:t>n khai h</w:t>
-      </w:r>
-      <w:r>
-        <w:t>ạ</w:t>
-      </w:r>
-      <w:r>
-        <w:t xml:space="preserve"> t</w:t>
-      </w:r>
-      <w:r>
-        <w:t>ầ</w:t>
-      </w:r>
-      <w:r>
-        <w:t>ng Mail Server (SMTP, IMAP, POP3) và các cơ ch</w:t>
-      </w:r>
-      <w:r>
-        <w:t>ế</w:t>
-      </w:r>
-      <w:r>
-        <w:t xml:space="preserve"> xác th</w:t>
-      </w:r>
-      <w:r>
-        <w:t>ự</w:t>
-      </w:r>
-      <w:r>
-        <w:t>c an toàn thông tin như SPF, DKIM, DMARC.</w:t>
+        <w:t>Nghiên cứu mô hình OSI/TCP-IP, cấu hình dịch vụ mạng doanh nghiệp, triển khai hạ tầng Mail Server (SMTP, IMAP, POP3) và các cơ chế xác thực an toàn thông tin như SPF, DKIM, DMARC.</w:t>
       </w:r>
     </w:p>
     <w:p>
       <w:pPr>
         <w:spacing w:before="240" w:after="40"/>
         <w:jc w:val="right"/>
-        <w:rPr>
-          <w:rFonts w:hint="eastAsia"/>
-        </w:rPr>
       </w:pPr>
       <w:r>
         <w:rPr>
@@ -1853,87 +328,7 @@
           <w:color w:val="718096"/>
           <w:sz w:val="19"/>
         </w:rPr>
-        <w:t>TP. H</w:t>
-      </w:r>
-      <w:r>
-        <w:rPr>
-          <w:i/>
-          <w:color w:val="718096"/>
-          <w:sz w:val="19"/>
-        </w:rPr>
-        <w:t>ồ</w:t>
-      </w:r>
-      <w:r>
-        <w:rPr>
-          <w:i/>
-          <w:color w:val="718096"/>
-          <w:sz w:val="19"/>
-        </w:rPr>
-        <w:t xml:space="preserve"> </w:t>
-      </w:r>
-      <w:r>
-        <w:rPr>
-          <w:i/>
-          <w:color w:val="718096"/>
-          <w:sz w:val="19"/>
-        </w:rPr>
-        <w:t>Chí Minh, ngày 12 tháng 08 n</w:t>
-      </w:r>
-      <w:r>
-        <w:rPr>
-          <w:i/>
-          <w:color w:val="718096"/>
-          <w:sz w:val="19"/>
-        </w:rPr>
-        <w:t>ă</w:t>
-      </w:r>
-      <w:r>
-        <w:rPr>
-          <w:i/>
-          <w:color w:val="718096"/>
-          <w:sz w:val="19"/>
-        </w:rPr>
-        <w:t>m</w:t>
-      </w:r>
-      <w:r>
-        <w:rPr>
-          <w:i/>
-          <w:color w:val="718096"/>
-          <w:sz w:val="19"/>
-        </w:rPr>
-        <w:t xml:space="preserve"> </w:t>
-      </w:r>
-      <w:r>
-        <w:rPr>
-          <w:i/>
-          <w:color w:val="718096"/>
-          <w:sz w:val="19"/>
-        </w:rPr>
-        <w:t>2</w:t>
-      </w:r>
-      <w:r>
-        <w:rPr>
-          <w:i/>
-          <w:color w:val="718096"/>
-          <w:sz w:val="19"/>
-        </w:rPr>
-        <w:t>0</w:t>
-      </w:r>
-      <w:r>
-        <w:rPr>
-          <w:i/>
-          <w:color w:val="718096"/>
-          <w:sz w:val="19"/>
-        </w:rPr>
-        <w:t>2</w:t>
-      </w:r>
-      <w:r>
-        <w:rPr>
-          <w:i/>
-          <w:color w:val="718096"/>
-          <w:sz w:val="19"/>
-        </w:rPr>
-        <w:t>6</w:t>
+        <w:t>TP. Hồ Chí Minh, ngày 12 tháng 08 năm 2026</w:t>
       </w:r>
     </w:p>
     <w:sectPr>
@@ -2434,11 +829,6 @@
     <w:lsdException w:name="Book Title" w:uiPriority="33" w:qFormat="1"/>
     <w:lsdException w:name="Bibliography" w:semiHidden="1" w:uiPriority="37" w:unhideWhenUsed="1"/>
     <w:lsdException w:name="TOC Heading" w:semiHidden="1" w:uiPriority="39" w:unhideWhenUsed="1" w:qFormat="1"/>
-    <w:lsdException w:name="Plain Table 5" w:semiHidden="1" w:unhideWhenUsed="1"/>
-    <w:lsdException w:name="Grid Table Light" w:semiHidden="1" w:unhideWhenUsed="1"/>
-    <w:lsdException w:name="Grid Table 1 Light" w:semiHidden="1" w:unhideWhenUsed="1"/>
-    <w:lsdException w:name="Grid Table 2" w:semiHidden="1" w:unhideWhenUsed="1"/>
-    <w:lsdException w:name="Grid Table 3" w:semiHidden="1" w:unhideWhenUsed="1"/>
     <w:lsdException w:name="Grid Table 4" w:uiPriority="49"/>
     <w:lsdException w:name="Grid Table 5 Dark" w:uiPriority="50"/>
     <w:lsdException w:name="Grid Table 6 Colorful" w:uiPriority="51"/>

</xml_diff>